<commit_message>
Recast access sentence to avoid stacked however constructions
Background paragraph now reads: "Although site access is currently
being evaluated, it will include driveway connections along both road
frontages: Page Road to the west and Airport Road to the east."

Co-Authored-By: Claude Fable 5 <noreply@anthropic.com>
Claude-Session: https://claude.ai/code/session_017bgXFHUDEAABZN3aMvsVWj
</commit_message>
<xml_diff>
--- a/3905_Page_Rd_Trip_Generation/SCP_Page_Road_Industrial_Trip_Generation_Memo.docx
+++ b/3905_Page_Rd_Trip_Generation/SCP_Page_Road_Industrial_Trip_Generation_Memo.docx
@@ -431,37 +431,10 @@
         <w:fldChar w:fldCharType="end"/>
       </w:r>
       <w:r>
-        <w:t xml:space="preserve"> below. Although the specific tenant has not been identified, the development is planned to be a single industrial building for light industrial use. The total building square footage in this concept plan is 132,080 sf; however, the analysis assumes up to 150,000 sf to provide a conservative buffer for minor changes to the building. Access </w:t>
-      </w:r>
-      <w:r>
-        <w:t>to the proposal site is currently being reviewed</w:t>
-      </w:r>
-      <w:r>
-        <w:t>;</w:t>
-      </w:r>
-      <w:r>
-        <w:t xml:space="preserve"> </w:t>
-      </w:r>
-      <w:r>
-        <w:t>however, it</w:t>
-      </w:r>
-      <w:r>
-        <w:t xml:space="preserve"> will include driveway connections to </w:t>
-      </w:r>
-      <w:r>
-        <w:t>Page Road</w:t>
-      </w:r>
-      <w:r>
-        <w:t xml:space="preserve"> along its western frontage</w:t>
-      </w:r>
-      <w:r>
-        <w:t xml:space="preserve"> and Airport Road</w:t>
-      </w:r>
-      <w:r>
-        <w:t xml:space="preserve"> along its eastern frontage</w:t>
-      </w:r>
-      <w:r>
-        <w:t>.</w:t>
+        <w:t xml:space="preserve"> below. Although the specific tenant has not been identified, the development is planned to be a single industrial building for light industrial use. The total building square footage in this concept plan is 132,080 sf; however, the analysis assumes up to 150,000 sf to provide a conservative buffer for minor changes to the building. </w:t>
+      </w:r>
+      <w:r>
+        <w:t xml:space="preserve">Although site access is currently being evaluated, it will include driveway connections along both road frontages: Page Road to the west and Airport Road to the east.</w:t>
       </w:r>
     </w:p>
     <w:p>

</xml_diff>

<commit_message>
Sync memo to team's returned version
Replaces the working copy with the version returned by the project team
(same content; concept plan image re-compressed by Word, figure caption
trailing space removed, page 2 header date left at August 13).

Co-Authored-By: Claude Fable 5 <noreply@anthropic.com>
Claude-Session: https://claude.ai/code/session_017bgXFHUDEAABZN3aMvsVWj
</commit_message>
<xml_diff>
--- a/3905_Page_Rd_Trip_Generation/SCP_Page_Road_Industrial_Trip_Generation_Memo.docx
+++ b/3905_Page_Rd_Trip_Generation/SCP_Page_Road_Industrial_Trip_Generation_Memo.docx
@@ -434,23 +434,36 @@
         <w:t xml:space="preserve"> below. Although the specific tenant has not been identified, the development is planned to be a single industrial building for light industrial use. The total building square footage in this concept plan is 132,080 sf; however, the analysis assumes up to 150,000 sf to provide a conservative buffer for minor changes to the building. </w:t>
       </w:r>
       <w:r>
-        <w:t xml:space="preserve">Although proposed site access is being evaluated, it will include driveway connections along both road frontages: Page Road to the west and Airport Road to the east.</w:t>
+        <w:t>Although</w:t>
+      </w:r>
+      <w:r>
+        <w:t xml:space="preserve"> </w:t>
+      </w:r>
+      <w:r>
+        <w:t>proposed site</w:t>
+      </w:r>
+      <w:r>
+        <w:t xml:space="preserve"> access is being evaluated, it will include driveway connections along both road frontages: Page Road to the west and Airport Road to the east.</w:t>
       </w:r>
     </w:p>
     <w:p>
       <w:pPr>
         <w:pStyle w:val="BodyText"/>
-        <w:spacing w:after="0" w:line="240" w:lineRule="auto"/>
+        <w:spacing w:line="240" w:lineRule="auto"/>
+        <w:jc w:val="center"/>
+        <w:rPr>
+          <w:rStyle w:val="TableTitleChar"/>
+        </w:rPr>
       </w:pPr>
       <w:r>
         <w:rPr>
           <w:noProof/>
         </w:rPr>
         <w:drawing>
-          <wp:inline distT="0" distB="0" distL="0" distR="0" wp14:anchorId="23B9266F" wp14:editId="27EED24D">
-            <wp:extent cx="6088380" cy="4168644"/>
+          <wp:inline distT="0" distB="0" distL="0" distR="0" wp14:anchorId="23B9266F" wp14:editId="58B3A13C">
+            <wp:extent cx="6088380" cy="4168140"/>
             <wp:effectExtent l="0" t="0" r="7620" b="3810"/>
-            <wp:docPr id="728698907" name="Picture 1" descr="A map of a city  AI-generated content may be incorrect."/>
+            <wp:docPr id="728698907" name="Picture 1"/>
             <wp:cNvGraphicFramePr>
               <a:graphicFrameLocks xmlns:a="http://schemas.openxmlformats.org/drawingml/2006/main" noChangeAspect="1"/>
             </wp:cNvGraphicFramePr>
@@ -458,12 +471,18 @@
               <a:graphicData uri="http://schemas.openxmlformats.org/drawingml/2006/picture">
                 <pic:pic xmlns:pic="http://schemas.openxmlformats.org/drawingml/2006/picture">
                   <pic:nvPicPr>
-                    <pic:cNvPr id="728698907" name="Picture 1" descr="A map of a city  AI-generated content may be incorrect."/>
+                    <pic:cNvPr id="728698907" name="Picture 1"/>
                     <pic:cNvPicPr/>
                   </pic:nvPicPr>
-                  <pic:blipFill rotWithShape="1">
-                    <a:blip r:embed="rId11"/>
-                    <a:srcRect b="4143"/>
+                  <pic:blipFill>
+                    <a:blip r:embed="rId11" cstate="print">
+                      <a:extLst>
+                        <a:ext uri="{28A0092B-C50C-407E-A947-70E740481C1C}">
+                          <a14:useLocalDpi xmlns:a14="http://schemas.microsoft.com/office/drawing/2010/main" val="0"/>
+                        </a:ext>
+                      </a:extLst>
+                    </a:blip>
+                    <a:srcRect t="1992" b="1992"/>
                     <a:stretch>
                       <a:fillRect/>
                     </a:stretch>
@@ -471,7 +490,7 @@
                   <pic:spPr bwMode="auto">
                     <a:xfrm>
                       <a:off x="0" y="0"/>
-                      <a:ext cx="6093596" cy="4172215"/>
+                      <a:ext cx="6088380" cy="4168140"/>
                     </a:xfrm>
                     <a:prstGeom prst="rect">
                       <a:avLst/>
@@ -491,16 +510,6 @@
           </wp:inline>
         </w:drawing>
       </w:r>
-    </w:p>
-    <w:p>
-      <w:pPr>
-        <w:pStyle w:val="BodyText"/>
-        <w:spacing w:line="240" w:lineRule="auto"/>
-        <w:jc w:val="center"/>
-        <w:rPr>
-          <w:rStyle w:val="TableTitleChar"/>
-        </w:rPr>
-      </w:pPr>
       <w:bookmarkStart w:id="1" w:name="_Ref208974195"/>
       <w:r>
         <w:rPr>
@@ -544,7 +553,7 @@
         <w:rPr>
           <w:rStyle w:val="TableTitleChar"/>
         </w:rPr>
-        <w:t xml:space="preserve">: Concept Plan </w:t>
+        <w:t>: Concept Plan</w:t>
       </w:r>
     </w:p>
     <w:p>
@@ -1460,11 +1469,6 @@
       <w:r>
         <w:t>, the proposed development is anticipated to generate 72 trips during the weekday AM peak hour and 74 trips during the weekday PM peak hour; therefore, a TIA is not required for the 3905 Page Road development. In addition, the total site trip generation of 540 daily trips is well below the NCDOT TIA threshold of 3,000 daily trips.</w:t>
       </w:r>
-    </w:p>
-    <w:p>
-      <w:pPr>
-        <w:pStyle w:val="BodyText"/>
-      </w:pPr>
     </w:p>
     <w:sectPr>
       <w:headerReference w:type="default" r:id="rId12"/>
@@ -1653,7 +1657,7 @@
       <w:t xml:space="preserve">August </w:t>
     </w:r>
     <w:r>
-      <w:t>20</w:t>
+      <w:t>13</w:t>
     </w:r>
     <w:r>
       <w:t>, 2026</w:t>
@@ -3040,7 +3044,6 @@
   <w:style w:type="character" w:default="1" w:styleId="DefaultParagraphFont">
     <w:name w:val="Default Paragraph Font"/>
     <w:uiPriority w:val="1"/>
-    <w:semiHidden/>
     <w:unhideWhenUsed/>
   </w:style>
   <w:style w:type="table" w:default="1" w:styleId="TableNormal">
@@ -3823,21 +3826,10 @@
 </file>
 
 <file path=customXml/item1.xml><?xml version="1.0" encoding="utf-8"?>
-<p:properties xmlns:p="http://schemas.microsoft.com/office/2006/metadata/properties" xmlns:xsi="http://www.w3.org/2001/XMLSchema-instance" xmlns:pc="http://schemas.microsoft.com/office/infopath/2007/PartnerControls">
-  <documentManagement/>
-</p:properties>
+<b:Sources xmlns:b="http://schemas.openxmlformats.org/officeDocument/2006/bibliography" xmlns="http://schemas.openxmlformats.org/officeDocument/2006/bibliography" SelectedStyle="\APASixthEditionOfficeOnline.xsl" StyleName="APA" Version="6"/>
 </file>
 
 <file path=customXml/item2.xml><?xml version="1.0" encoding="utf-8"?>
-<?mso-contentType ?>
-<FormTemplates xmlns="http://schemas.microsoft.com/sharepoint/v3/contenttype/forms">
-  <Display>DocumentLibraryForm</Display>
-  <Edit>DocumentLibraryForm</Edit>
-  <New>DocumentLibraryForm</New>
-</FormTemplates>
-</file>
-
-<file path=customXml/item3.xml><?xml version="1.0" encoding="utf-8"?>
 <ct:contentTypeSchema xmlns:ct="http://schemas.microsoft.com/office/2006/metadata/contentType" xmlns:ma="http://schemas.microsoft.com/office/2006/metadata/properties/metaAttributes" ct:_="" ma:_="" ma:contentTypeName="Document" ma:contentTypeID="0x0101002721F367071CEE4896DD5555429BBAC4" ma:contentTypeVersion="8" ma:contentTypeDescription="Create a new document." ma:contentTypeScope="" ma:versionID="fe7a963e4a6c00a96b9cb54026962d3f">
   <xsd:schema xmlns:xsd="http://www.w3.org/2001/XMLSchema" xmlns:xs="http://www.w3.org/2001/XMLSchema" xmlns:p="http://schemas.microsoft.com/office/2006/metadata/properties" xmlns:ns2="9a3d5214-0f3a-41d0-9cc0-4cb3d0f21e5b" targetNamespace="http://schemas.microsoft.com/office/2006/metadata/properties" ma:root="true" ma:fieldsID="fb251f28cb6f10c5937c8eaa2dd04c87" ns2:_="">
     <xsd:import namespace="9a3d5214-0f3a-41d0-9cc0-4cb3d0f21e5b"/>
@@ -4009,28 +4001,30 @@
 </ct:contentTypeSchema>
 </file>
 
+<file path=customXml/item3.xml><?xml version="1.0" encoding="utf-8"?>
+<?mso-contentType ?>
+<FormTemplates xmlns="http://schemas.microsoft.com/sharepoint/v3/contenttype/forms">
+  <Display>DocumentLibraryForm</Display>
+  <Edit>DocumentLibraryForm</Edit>
+  <New>DocumentLibraryForm</New>
+</FormTemplates>
+</file>
+
 <file path=customXml/item4.xml><?xml version="1.0" encoding="utf-8"?>
-<b:Sources xmlns:b="http://schemas.openxmlformats.org/officeDocument/2006/bibliography" xmlns="http://schemas.openxmlformats.org/officeDocument/2006/bibliography" SelectedStyle="\APASixthEditionOfficeOnline.xsl" StyleName="APA" Version="6"/>
+<p:properties xmlns:p="http://schemas.microsoft.com/office/2006/metadata/properties" xmlns:xsi="http://www.w3.org/2001/XMLSchema-instance" xmlns:pc="http://schemas.microsoft.com/office/infopath/2007/PartnerControls">
+  <documentManagement/>
+</p:properties>
 </file>
 
 <file path=customXml/itemProps1.xml><?xml version="1.0" encoding="utf-8"?>
-<ds:datastoreItem xmlns:ds="http://schemas.openxmlformats.org/officeDocument/2006/customXml" ds:itemID="{F5011B99-2705-4E9B-BFAC-C71B15C2BA1F}">
+<ds:datastoreItem xmlns:ds="http://schemas.openxmlformats.org/officeDocument/2006/customXml" ds:itemID="{E4D3DD68-7896-4C7F-96CB-486F25EC72F3}">
   <ds:schemaRefs>
-    <ds:schemaRef ds:uri="http://schemas.microsoft.com/office/2006/metadata/properties"/>
-    <ds:schemaRef ds:uri="http://schemas.microsoft.com/office/infopath/2007/PartnerControls"/>
+    <ds:schemaRef ds:uri="http://schemas.openxmlformats.org/officeDocument/2006/bibliography"/>
   </ds:schemaRefs>
 </ds:datastoreItem>
 </file>
 
 <file path=customXml/itemProps2.xml><?xml version="1.0" encoding="utf-8"?>
-<ds:datastoreItem xmlns:ds="http://schemas.openxmlformats.org/officeDocument/2006/customXml" ds:itemID="{3132D4A4-5C44-46CD-A86A-4991EA9F08B1}">
-  <ds:schemaRefs>
-    <ds:schemaRef ds:uri="http://schemas.microsoft.com/sharepoint/v3/contenttype/forms"/>
-  </ds:schemaRefs>
-</ds:datastoreItem>
-</file>
-
-<file path=customXml/itemProps3.xml><?xml version="1.0" encoding="utf-8"?>
 <ds:datastoreItem xmlns:ds="http://schemas.openxmlformats.org/officeDocument/2006/customXml" ds:itemID="{64000242-6817-4F7F-9398-F87F1E5916E2}">
   <ds:schemaRefs>
     <ds:schemaRef ds:uri="http://schemas.microsoft.com/office/2006/metadata/contentType"/>
@@ -4048,10 +4042,19 @@
 </ds:datastoreItem>
 </file>
 
+<file path=customXml/itemProps3.xml><?xml version="1.0" encoding="utf-8"?>
+<ds:datastoreItem xmlns:ds="http://schemas.openxmlformats.org/officeDocument/2006/customXml" ds:itemID="{3132D4A4-5C44-46CD-A86A-4991EA9F08B1}">
+  <ds:schemaRefs>
+    <ds:schemaRef ds:uri="http://schemas.microsoft.com/sharepoint/v3/contenttype/forms"/>
+  </ds:schemaRefs>
+</ds:datastoreItem>
+</file>
+
 <file path=customXml/itemProps4.xml><?xml version="1.0" encoding="utf-8"?>
-<ds:datastoreItem xmlns:ds="http://schemas.openxmlformats.org/officeDocument/2006/customXml" ds:itemID="{E4D3DD68-7896-4C7F-96CB-486F25EC72F3}">
+<ds:datastoreItem xmlns:ds="http://schemas.openxmlformats.org/officeDocument/2006/customXml" ds:itemID="{F5011B99-2705-4E9B-BFAC-C71B15C2BA1F}">
   <ds:schemaRefs>
-    <ds:schemaRef ds:uri="http://schemas.openxmlformats.org/officeDocument/2006/bibliography"/>
+    <ds:schemaRef ds:uri="http://schemas.microsoft.com/office/2006/metadata/properties"/>
+    <ds:schemaRef ds:uri="http://schemas.microsoft.com/office/infopath/2007/PartnerControls"/>
   </ds:schemaRefs>
 </ds:datastoreItem>
 </file>
</xml_diff>

<commit_message>
Sync memo to team copy with header date field
Page 2 header date is now the same auto DATE field used in the memo date
block rather than typed text; body text and figures unchanged.

Co-Authored-By: Claude Fable 5 <noreply@anthropic.com>
Claude-Session: https://claude.ai/code/session_017bgXFHUDEAABZN3aMvsVWj
</commit_message>
<xml_diff>
--- a/3905_Page_Rd_Trip_Generation/SCP_Page_Road_Industrial_Trip_Generation_Memo.docx
+++ b/3905_Page_Rd_Trip_Generation/SCP_Page_Road_Industrial_Trip_Generation_Memo.docx
@@ -1654,13 +1654,22 @@
       <w:pStyle w:val="Header"/>
     </w:pPr>
     <w:r>
-      <w:t xml:space="preserve">August </w:t>
+      <w:fldChar w:fldCharType="begin"/>
     </w:r>
     <w:r>
-      <w:t>20</w:t>
+      <w:instrText xml:space="preserve"> DATE \@ "MMMM d, yyyy" </w:instrText>
     </w:r>
     <w:r>
-      <w:t>, 2026</w:t>
+      <w:fldChar w:fldCharType="separate"/>
+    </w:r>
+    <w:r>
+      <w:rPr>
+        <w:noProof/>
+      </w:rPr>
+      <w:t>August 20, 2026</w:t>
+    </w:r>
+    <w:r>
+      <w:fldChar w:fldCharType="end"/>
     </w:r>
   </w:p>
   <w:p>
@@ -3044,6 +3053,7 @@
   <w:style w:type="character" w:default="1" w:styleId="DefaultParagraphFont">
     <w:name w:val="Default Paragraph Font"/>
     <w:uiPriority w:val="1"/>
+    <w:semiHidden/>
     <w:unhideWhenUsed/>
   </w:style>
   <w:style w:type="table" w:default="1" w:styleId="TableNormal">
@@ -3826,10 +3836,21 @@
 </file>
 
 <file path=customXml/item1.xml><?xml version="1.0" encoding="utf-8"?>
-<b:Sources xmlns:b="http://schemas.openxmlformats.org/officeDocument/2006/bibliography" xmlns="http://schemas.openxmlformats.org/officeDocument/2006/bibliography" SelectedStyle="\APASixthEditionOfficeOnline.xsl" StyleName="APA" Version="6"/>
+<p:properties xmlns:p="http://schemas.microsoft.com/office/2006/metadata/properties" xmlns:xsi="http://www.w3.org/2001/XMLSchema-instance" xmlns:pc="http://schemas.microsoft.com/office/infopath/2007/PartnerControls">
+  <documentManagement/>
+</p:properties>
 </file>
 
 <file path=customXml/item2.xml><?xml version="1.0" encoding="utf-8"?>
+<?mso-contentType ?>
+<FormTemplates xmlns="http://schemas.microsoft.com/sharepoint/v3/contenttype/forms">
+  <Display>DocumentLibraryForm</Display>
+  <Edit>DocumentLibraryForm</Edit>
+  <New>DocumentLibraryForm</New>
+</FormTemplates>
+</file>
+
+<file path=customXml/item3.xml><?xml version="1.0" encoding="utf-8"?>
 <ct:contentTypeSchema xmlns:ct="http://schemas.microsoft.com/office/2006/metadata/contentType" xmlns:ma="http://schemas.microsoft.com/office/2006/metadata/properties/metaAttributes" ct:_="" ma:_="" ma:contentTypeName="Document" ma:contentTypeID="0x0101002721F367071CEE4896DD5555429BBAC4" ma:contentTypeVersion="8" ma:contentTypeDescription="Create a new document." ma:contentTypeScope="" ma:versionID="fe7a963e4a6c00a96b9cb54026962d3f">
   <xsd:schema xmlns:xsd="http://www.w3.org/2001/XMLSchema" xmlns:xs="http://www.w3.org/2001/XMLSchema" xmlns:p="http://schemas.microsoft.com/office/2006/metadata/properties" xmlns:ns2="9a3d5214-0f3a-41d0-9cc0-4cb3d0f21e5b" targetNamespace="http://schemas.microsoft.com/office/2006/metadata/properties" ma:root="true" ma:fieldsID="fb251f28cb6f10c5937c8eaa2dd04c87" ns2:_="">
     <xsd:import namespace="9a3d5214-0f3a-41d0-9cc0-4cb3d0f21e5b"/>
@@ -4001,30 +4022,28 @@
 </ct:contentTypeSchema>
 </file>
 
-<file path=customXml/item3.xml><?xml version="1.0" encoding="utf-8"?>
-<?mso-contentType ?>
-<FormTemplates xmlns="http://schemas.microsoft.com/sharepoint/v3/contenttype/forms">
-  <Display>DocumentLibraryForm</Display>
-  <Edit>DocumentLibraryForm</Edit>
-  <New>DocumentLibraryForm</New>
-</FormTemplates>
-</file>
-
 <file path=customXml/item4.xml><?xml version="1.0" encoding="utf-8"?>
-<p:properties xmlns:p="http://schemas.microsoft.com/office/2006/metadata/properties" xmlns:xsi="http://www.w3.org/2001/XMLSchema-instance" xmlns:pc="http://schemas.microsoft.com/office/infopath/2007/PartnerControls">
-  <documentManagement/>
-</p:properties>
+<b:Sources xmlns:b="http://schemas.openxmlformats.org/officeDocument/2006/bibliography" xmlns="http://schemas.openxmlformats.org/officeDocument/2006/bibliography" SelectedStyle="\APASixthEditionOfficeOnline.xsl" StyleName="APA" Version="6"/>
 </file>
 
 <file path=customXml/itemProps1.xml><?xml version="1.0" encoding="utf-8"?>
-<ds:datastoreItem xmlns:ds="http://schemas.openxmlformats.org/officeDocument/2006/customXml" ds:itemID="{E4D3DD68-7896-4C7F-96CB-486F25EC72F3}">
+<ds:datastoreItem xmlns:ds="http://schemas.openxmlformats.org/officeDocument/2006/customXml" ds:itemID="{F5011B99-2705-4E9B-BFAC-C71B15C2BA1F}">
   <ds:schemaRefs>
-    <ds:schemaRef ds:uri="http://schemas.openxmlformats.org/officeDocument/2006/bibliography"/>
+    <ds:schemaRef ds:uri="http://schemas.microsoft.com/office/2006/metadata/properties"/>
+    <ds:schemaRef ds:uri="http://schemas.microsoft.com/office/infopath/2007/PartnerControls"/>
   </ds:schemaRefs>
 </ds:datastoreItem>
 </file>
 
 <file path=customXml/itemProps2.xml><?xml version="1.0" encoding="utf-8"?>
+<ds:datastoreItem xmlns:ds="http://schemas.openxmlformats.org/officeDocument/2006/customXml" ds:itemID="{3132D4A4-5C44-46CD-A86A-4991EA9F08B1}">
+  <ds:schemaRefs>
+    <ds:schemaRef ds:uri="http://schemas.microsoft.com/sharepoint/v3/contenttype/forms"/>
+  </ds:schemaRefs>
+</ds:datastoreItem>
+</file>
+
+<file path=customXml/itemProps3.xml><?xml version="1.0" encoding="utf-8"?>
 <ds:datastoreItem xmlns:ds="http://schemas.openxmlformats.org/officeDocument/2006/customXml" ds:itemID="{64000242-6817-4F7F-9398-F87F1E5916E2}">
   <ds:schemaRefs>
     <ds:schemaRef ds:uri="http://schemas.microsoft.com/office/2006/metadata/contentType"/>
@@ -4042,19 +4061,10 @@
 </ds:datastoreItem>
 </file>
 
-<file path=customXml/itemProps3.xml><?xml version="1.0" encoding="utf-8"?>
-<ds:datastoreItem xmlns:ds="http://schemas.openxmlformats.org/officeDocument/2006/customXml" ds:itemID="{3132D4A4-5C44-46CD-A86A-4991EA9F08B1}">
+<file path=customXml/itemProps4.xml><?xml version="1.0" encoding="utf-8"?>
+<ds:datastoreItem xmlns:ds="http://schemas.openxmlformats.org/officeDocument/2006/customXml" ds:itemID="{E4D3DD68-7896-4C7F-96CB-486F25EC72F3}">
   <ds:schemaRefs>
-    <ds:schemaRef ds:uri="http://schemas.microsoft.com/sharepoint/v3/contenttype/forms"/>
-  </ds:schemaRefs>
-</ds:datastoreItem>
-</file>
-
-<file path=customXml/itemProps4.xml><?xml version="1.0" encoding="utf-8"?>
-<ds:datastoreItem xmlns:ds="http://schemas.openxmlformats.org/officeDocument/2006/customXml" ds:itemID="{F5011B99-2705-4E9B-BFAC-C71B15C2BA1F}">
-  <ds:schemaRefs>
-    <ds:schemaRef ds:uri="http://schemas.microsoft.com/office/2006/metadata/properties"/>
-    <ds:schemaRef ds:uri="http://schemas.microsoft.com/office/infopath/2007/PartnerControls"/>
+    <ds:schemaRef ds:uri="http://schemas.openxmlformats.org/officeDocument/2006/bibliography"/>
   </ds:schemaRefs>
 </ds:datastoreItem>
 </file>
</xml_diff>